<commit_message>
Update public Resume PDF & DOCX and push latest floral scroll transitions for Vercel deployment
</commit_message>
<xml_diff>
--- a/Resume-Rishu.docx
+++ b/Resume-Rishu.docx
@@ -344,7 +344,7 @@
           <w:sz w:val="20"/>
           <w:szCs w:val="20"/>
         </w:rPr>
-        <w:t xml:space="preserve">June </w:t>
+        <w:t xml:space="preserve">Jun </w:t>
       </w:r>
       <w:r>
         <w:rPr>
@@ -664,7 +664,7 @@
           <w:sz w:val="20"/>
           <w:szCs w:val="20"/>
         </w:rPr>
-        <w:t>June</w:t>
+        <w:t>Jun</w:t>
       </w:r>
       <w:r>
         <w:rPr>
@@ -810,7 +810,7 @@
           <w:sz w:val="20"/>
           <w:szCs w:val="20"/>
         </w:rPr>
-        <w:t>Percentage:91</w:t>
+        <w:t>Percent:91</w:t>
       </w:r>
       <w:r>
         <w:rPr>
@@ -959,7 +959,7 @@
           <w:sz w:val="20"/>
           <w:szCs w:val="20"/>
         </w:rPr>
-        <w:t>March</w:t>
+        <w:t>Mar</w:t>
       </w:r>
       <w:r>
         <w:rPr>
@@ -1081,7 +1081,7 @@
           <w:sz w:val="20"/>
           <w:szCs w:val="20"/>
         </w:rPr>
-        <w:t>Percentage:72.2</w:t>
+        <w:t>Percent:72.2</w:t>
       </w:r>
       <w:r>
         <w:rPr>
@@ -1235,7 +1235,7 @@
           <w:sz w:val="20"/>
           <w:szCs w:val="20"/>
         </w:rPr>
-        <w:t>March</w:t>
+        <w:t>Mar</w:t>
       </w:r>
       <w:r>
         <w:rPr>
@@ -1316,6 +1316,101 @@
     </w:p>
     <w:p>
       <w:pPr>
+        <w:tabs>
+          <w:tab w:val="center" w:pos="4680"/>
+          <w:tab w:val="right" w:pos="10344"/>
+          <w:tab w:val="center" w:pos="0"/>
+        </w:tabs>
+        <w:spacing w:after="0" w:line="240" w:lineRule="auto"/>
+        <w:rPr>
+          <w:rFonts w:ascii="Times New Roman" w:eastAsia="Times New Roman" w:hAnsi="Times New Roman" w:cs="Times New Roman"/>
+          <w:i/>
+          <w:iCs/>
+          <w:sz w:val="20"/>
+          <w:szCs w:val="20"/>
+        </w:rPr>
+      </w:pPr>
+      <w:r>
+        <w:rPr>
+          <w:rFonts w:ascii="Times New Roman" w:eastAsia="Times New Roman" w:hAnsi="Times New Roman" w:cs="Times New Roman"/>
+          <w:b/>
+          <w:bCs/>
+          <w:i/>
+          <w:iCs/>
+          <w:sz w:val="20"/>
+          <w:szCs w:val="20"/>
+        </w:rPr>
+        <w:t xml:space="preserve"> Portfolio Website</w:t>
+      </w:r>
+      <w:r>
+        <w:rPr>
+          <w:rFonts w:ascii="Times New Roman" w:eastAsia="Times New Roman" w:hAnsi="Times New Roman" w:cs="Times New Roman"/>
+          <w:i/>
+          <w:iCs/>
+          <w:sz w:val="20"/>
+          <w:szCs w:val="20"/>
+        </w:rPr>
+        <w:t xml:space="preserve"> </w:t>
+      </w:r>
+      <w:r>
+        <w:rPr>
+          <w:rFonts w:ascii="Times New Roman" w:eastAsia="Times New Roman" w:hAnsi="Times New Roman" w:cs="Times New Roman"/>
+          <w:i/>
+          <w:iCs/>
+          <w:sz w:val="20"/>
+          <w:szCs w:val="20"/>
+        </w:rPr>
+        <w:tab/>
+      </w:r>
+      <w:r>
+        <w:rPr>
+          <w:rFonts w:ascii="Times New Roman" w:eastAsia="Times New Roman" w:hAnsi="Times New Roman" w:cs="Times New Roman"/>
+          <w:i/>
+          <w:iCs/>
+          <w:sz w:val="20"/>
+          <w:szCs w:val="20"/>
+        </w:rPr>
+        <w:tab/>
+        <w:t xml:space="preserve">                Sep 2026 </w:t>
+      </w:r>
+    </w:p>
+    <w:p>
+      <w:pPr>
+        <w:numPr>
+          <w:ilvl w:val="0"/>
+          <w:numId w:val="12"/>
+        </w:numPr>
+        <w:tabs>
+          <w:tab w:val="center" w:pos="4680"/>
+          <w:tab w:val="center" w:pos="0"/>
+          <w:tab w:val="right" w:pos="9360"/>
+          <w:tab w:val="center" w:pos="0"/>
+        </w:tabs>
+        <w:spacing w:after="0" w:line="240" w:lineRule="auto"/>
+        <w:rPr>
+          <w:sz w:val="20"/>
+          <w:szCs w:val="20"/>
+        </w:rPr>
+      </w:pPr>
+      <w:r>
+        <w:rPr>
+          <w:rFonts w:ascii="Times New Roman" w:eastAsia="Times New Roman" w:hAnsi="Times New Roman" w:cs="Times New Roman"/>
+          <w:sz w:val="20"/>
+          <w:szCs w:val="20"/>
+        </w:rPr>
+        <w:t>Designed and built a personal portfolio website to showcase professional experience, skills, and projects using AI-assisted development tools and technical mentorship</w:t>
+      </w:r>
+      <w:r>
+        <w:rPr>
+          <w:rFonts w:ascii="Times New Roman" w:eastAsia="Times New Roman" w:hAnsi="Times New Roman" w:cs="Times New Roman"/>
+          <w:sz w:val="20"/>
+          <w:szCs w:val="20"/>
+        </w:rPr>
+        <w:t>.</w:t>
+      </w:r>
+    </w:p>
+    <w:p>
+      <w:pPr>
         <w:pBdr>
           <w:top w:val="nil"/>
           <w:left w:val="nil"/>
@@ -1337,6 +1432,30 @@
           <w:szCs w:val="20"/>
         </w:rPr>
       </w:pPr>
+    </w:p>
+    <w:p>
+      <w:pPr>
+        <w:pBdr>
+          <w:top w:val="nil"/>
+          <w:left w:val="nil"/>
+          <w:bottom w:val="nil"/>
+          <w:right w:val="nil"/>
+          <w:between w:val="nil"/>
+        </w:pBdr>
+        <w:tabs>
+          <w:tab w:val="center" w:pos="4680"/>
+          <w:tab w:val="right" w:pos="10344"/>
+          <w:tab w:val="center" w:pos="0"/>
+        </w:tabs>
+        <w:spacing w:after="0" w:line="240" w:lineRule="auto"/>
+        <w:rPr>
+          <w:rFonts w:ascii="Times New Roman" w:eastAsia="Times New Roman" w:hAnsi="Times New Roman" w:cs="Times New Roman"/>
+          <w:i/>
+          <w:color w:val="000000"/>
+          <w:sz w:val="20"/>
+          <w:szCs w:val="20"/>
+        </w:rPr>
+      </w:pPr>
       <w:r>
         <w:rPr>
           <w:rFonts w:ascii="Times New Roman" w:eastAsia="Times New Roman" w:hAnsi="Times New Roman" w:cs="Times New Roman"/>
@@ -1404,7 +1523,7 @@
           <w:sz w:val="20"/>
           <w:szCs w:val="20"/>
         </w:rPr>
-        <w:t>January</w:t>
+        <w:t>Jan</w:t>
       </w:r>
       <w:r>
         <w:rPr>
@@ -1450,7 +1569,7 @@
           <w:sz w:val="20"/>
           <w:szCs w:val="20"/>
         </w:rPr>
-        <w:t>June</w:t>
+        <w:t>Jun</w:t>
       </w:r>
       <w:r>
         <w:rPr>
@@ -1628,13 +1747,6 @@
     </w:p>
     <w:p>
       <w:pPr>
-        <w:pBdr>
-          <w:top w:val="nil"/>
-          <w:left w:val="nil"/>
-          <w:bottom w:val="nil"/>
-          <w:right w:val="nil"/>
-          <w:between w:val="nil"/>
-        </w:pBdr>
         <w:tabs>
           <w:tab w:val="center" w:pos="4680"/>
           <w:tab w:val="center" w:pos="0"/>
@@ -1643,55 +1755,27 @@
         </w:tabs>
         <w:spacing w:after="0" w:line="240" w:lineRule="auto"/>
         <w:rPr>
-          <w:rFonts w:ascii="Times New Roman" w:eastAsia="Times New Roman" w:hAnsi="Times New Roman" w:cs="Times New Roman"/>
-          <w:bCs/>
-          <w:color w:val="000000"/>
-          <w:sz w:val="20"/>
-          <w:szCs w:val="20"/>
-        </w:rPr>
-      </w:pPr>
+          <w:sz w:val="20"/>
+          <w:szCs w:val="20"/>
+        </w:rPr>
+      </w:pPr>
+      <w:r>
+        <w:rPr>
+          <w:rFonts w:ascii="Times New Roman" w:eastAsia="Times New Roman" w:hAnsi="Times New Roman" w:cs="Times New Roman"/>
+          <w:b/>
+          <w:color w:val="000000"/>
+          <w:sz w:val="20"/>
+          <w:szCs w:val="20"/>
+        </w:rPr>
+        <w:tab/>
+        <w:t xml:space="preserve">       </w:t>
+      </w:r>
     </w:p>
     <w:p>
       <w:pPr>
         <w:pBdr>
           <w:top w:val="nil"/>
           <w:left w:val="nil"/>
-          <w:bottom w:val="nil"/>
-          <w:right w:val="nil"/>
-          <w:between w:val="nil"/>
-        </w:pBdr>
-        <w:tabs>
-          <w:tab w:val="center" w:pos="4680"/>
-          <w:tab w:val="center" w:pos="0"/>
-          <w:tab w:val="right" w:pos="9360"/>
-          <w:tab w:val="center" w:pos="0"/>
-        </w:tabs>
-        <w:spacing w:after="0" w:line="240" w:lineRule="auto"/>
-        <w:rPr>
-          <w:rFonts w:ascii="Times New Roman" w:eastAsia="Times New Roman" w:hAnsi="Times New Roman" w:cs="Times New Roman"/>
-          <w:color w:val="000000"/>
-          <w:sz w:val="20"/>
-          <w:szCs w:val="20"/>
-        </w:rPr>
-      </w:pPr>
-      <w:r>
-        <w:rPr>
-          <w:rFonts w:ascii="Times New Roman" w:eastAsia="Times New Roman" w:hAnsi="Times New Roman" w:cs="Times New Roman"/>
-          <w:b/>
-          <w:color w:val="000000"/>
-          <w:sz w:val="20"/>
-          <w:szCs w:val="20"/>
-        </w:rPr>
-        <w:tab/>
-        <w:t xml:space="preserve">       </w:t>
-      </w:r>
-    </w:p>
-    <w:p>
-      <w:pPr>
-        <w:pBdr>
-          <w:top w:val="nil"/>
-          <w:left w:val="nil"/>
-          <w:bottom w:val="single" w:sz="4" w:space="1" w:color="000000"/>
           <w:right w:val="nil"/>
           <w:between w:val="nil"/>
         </w:pBdr>
@@ -1745,7 +1829,55 @@
           <w:sz w:val="20"/>
           <w:szCs w:val="20"/>
         </w:rPr>
-        <w:t xml:space="preserve">                                                                                                         June 2023- December 2023</w:t>
+        <w:t xml:space="preserve">                                                                                                        </w:t>
+      </w:r>
+      <w:r>
+        <w:rPr>
+          <w:rFonts w:ascii="Times New Roman" w:eastAsia="Times New Roman" w:hAnsi="Times New Roman" w:cs="Times New Roman"/>
+          <w:bCs/>
+          <w:i/>
+          <w:iCs/>
+          <w:color w:val="000000"/>
+          <w:sz w:val="20"/>
+          <w:szCs w:val="20"/>
+        </w:rPr>
+        <w:t xml:space="preserve">            </w:t>
+      </w:r>
+      <w:r>
+        <w:rPr>
+          <w:rFonts w:ascii="Times New Roman" w:eastAsia="Times New Roman" w:hAnsi="Times New Roman" w:cs="Times New Roman"/>
+          <w:bCs/>
+          <w:i/>
+          <w:iCs/>
+          <w:color w:val="000000"/>
+          <w:sz w:val="20"/>
+          <w:szCs w:val="20"/>
+        </w:rPr>
+        <w:t xml:space="preserve"> Ju</w:t>
+      </w:r>
+      <w:r>
+        <w:rPr>
+          <w:rFonts w:ascii="Times New Roman" w:eastAsia="Times New Roman" w:hAnsi="Times New Roman" w:cs="Times New Roman"/>
+          <w:bCs/>
+          <w:i/>
+          <w:iCs/>
+          <w:color w:val="000000"/>
+          <w:sz w:val="20"/>
+          <w:szCs w:val="20"/>
+        </w:rPr>
+        <w:t>n</w:t>
+      </w:r>
+      <w:r>
+        <w:rPr>
+          <w:rFonts w:ascii="Times New Roman" w:eastAsia="Times New Roman" w:hAnsi="Times New Roman" w:cs="Times New Roman"/>
+          <w:bCs/>
+          <w:i/>
+          <w:iCs/>
+          <w:color w:val="000000"/>
+          <w:sz w:val="20"/>
+          <w:szCs w:val="20"/>
+        </w:rPr>
+        <w:t xml:space="preserve"> 2023- Dec 2023</w:t>
       </w:r>
     </w:p>
     <w:p>
@@ -2109,7 +2241,25 @@
           <w:sz w:val="20"/>
           <w:szCs w:val="20"/>
         </w:rPr>
-        <w:t>April 2015</w:t>
+        <w:t>Ap</w:t>
+      </w:r>
+      <w:r>
+        <w:rPr>
+          <w:rFonts w:ascii="Times New Roman" w:eastAsia="Times New Roman" w:hAnsi="Times New Roman" w:cs="Times New Roman"/>
+          <w:i/>
+          <w:sz w:val="20"/>
+          <w:szCs w:val="20"/>
+        </w:rPr>
+        <w:t>r</w:t>
+      </w:r>
+      <w:r>
+        <w:rPr>
+          <w:rFonts w:ascii="Times New Roman" w:eastAsia="Times New Roman" w:hAnsi="Times New Roman" w:cs="Times New Roman"/>
+          <w:i/>
+          <w:sz w:val="20"/>
+          <w:szCs w:val="20"/>
+        </w:rPr>
+        <w:t xml:space="preserve"> 2015</w:t>
       </w:r>
       <w:r>
         <w:rPr>
@@ -2128,7 +2278,7 @@
           <w:sz w:val="20"/>
           <w:szCs w:val="20"/>
         </w:rPr>
-        <w:t>March 2016</w:t>
+        <w:t>Mar 2016</w:t>
       </w:r>
     </w:p>
     <w:p>
@@ -2803,7 +2953,7 @@
           <w:sz w:val="20"/>
           <w:szCs w:val="20"/>
         </w:rPr>
-        <w:t xml:space="preserve">R programming, </w:t>
+        <w:t>R programming</w:t>
       </w:r>
     </w:p>
     <w:p>
@@ -2850,7 +3000,7 @@
           <w:sz w:val="20"/>
           <w:szCs w:val="20"/>
         </w:rPr>
-        <w:t xml:space="preserve">English (Advanced), R (Proficient), </w:t>
+        <w:t>English (Advanced), R (Proficient)</w:t>
       </w:r>
     </w:p>
     <w:p>
@@ -2913,6 +3063,119 @@
 <file path=word/numbering.xml><?xml version="1.0" encoding="utf-8"?>
 <w:numbering xmlns:wpc="http://schemas.microsoft.com/office/word/2010/wordprocessingCanvas" xmlns:cx="http://schemas.microsoft.com/office/drawing/2014/chartex" xmlns:cx1="http://schemas.microsoft.com/office/drawing/2015/9/8/chartex" xmlns:cx2="http://schemas.microsoft.com/office/drawing/2015/10/21/chartex" xmlns:cx3="http://schemas.microsoft.com/office/drawing/2016/5/9/chartex" xmlns:cx4="http://schemas.microsoft.com/office/drawing/2016/5/10/chartex" xmlns:cx5="http://schemas.microsoft.com/office/drawing/2016/5/11/chartex" xmlns:cx6="http://schemas.microsoft.com/office/drawing/2016/5/12/chartex" xmlns:cx7="http://schemas.microsoft.com/office/drawing/2016/5/13/chartex" xmlns:cx8="http://schemas.microsoft.com/office/drawing/2016/5/14/chartex" xmlns:mc="http://schemas.openxmlformats.org/markup-compatibility/2006" xmlns:aink="http://schemas.microsoft.com/office/drawing/2016/ink" xmlns:am3d="http://schemas.microsoft.com/office/drawing/2017/model3d" xmlns:o="urn:schemas-microsoft-com:office:office" xmlns:oel="http://schemas.microsoft.com/office/2019/extlst" xmlns:r="http://schemas.openxmlformats.org/officeDocument/2006/relationships" xmlns:m="http://schemas.openxmlformats.org/officeDocument/2006/math" xmlns:v="urn:schemas-microsoft-com:vml" xmlns:wp14="http://schemas.microsoft.com/office/word/2010/wordprocessingDrawing" xmlns:wp="http://schemas.openxmlformats.org/drawingml/2006/wordprocessingDrawing" xmlns:w10="urn:schemas-microsoft-com:office:word" xmlns:w="http://schemas.openxmlformats.org/wordprocessingml/2006/main" xmlns:w14="http://schemas.microsoft.com/office/word/2010/wordml" xmlns:w15="http://schemas.microsoft.com/office/word/2012/wordml" xmlns:w16cex="http://schemas.microsoft.com/office/word/2018/wordml/cex" xmlns:w16cid="http://schemas.microsoft.com/office/word/2016/wordml/cid" xmlns:w16="http://schemas.microsoft.com/office/word/2018/wordml" xmlns:w16du="http://schemas.microsoft.com/office/word/2023/wordml/word16du" xmlns:w16sdtdh="http://schemas.microsoft.com/office/word/2020/wordml/sdtdatahash" xmlns:w16sdtfl="http://schemas.microsoft.com/office/word/2024/wordml/sdtformatlock" xmlns:w16se="http://schemas.microsoft.com/office/word/2015/wordml/symex" xmlns:wpg="http://schemas.microsoft.com/office/word/2010/wordprocessingGroup" xmlns:wpi="http://schemas.microsoft.com/office/word/2010/wordprocessingInk" xmlns:wne="http://schemas.microsoft.com/office/word/2006/wordml" xmlns:wps="http://schemas.microsoft.com/office/word/2010/wordprocessingShape" mc:Ignorable="w14 w15 w16se w16cid w16 w16cex w16sdtdh w16sdtfl w16du wp14">
   <w:abstractNum w:abstractNumId="0" w15:restartNumberingAfterBreak="0">
+    <w:nsid w:val="01CA50E7"/>
+    <w:multiLevelType w:val="multilevel"/>
+    <w:tmpl w:val="C6B6E246"/>
+    <w:lvl w:ilvl="0">
+      <w:start w:val="1"/>
+      <w:numFmt w:val="bullet"/>
+      <w:lvlText w:val="●"/>
+      <w:lvlJc w:val="left"/>
+      <w:pPr>
+        <w:ind w:left="720" w:hanging="360"/>
+      </w:pPr>
+      <w:rPr>
+        <w:rFonts w:ascii="Noto Sans Symbols" w:eastAsia="Noto Sans Symbols" w:hAnsi="Noto Sans Symbols" w:cs="Noto Sans Symbols"/>
+      </w:rPr>
+    </w:lvl>
+    <w:lvl w:ilvl="1">
+      <w:start w:val="1"/>
+      <w:numFmt w:val="bullet"/>
+      <w:lvlText w:val="o"/>
+      <w:lvlJc w:val="left"/>
+      <w:pPr>
+        <w:ind w:left="1440" w:hanging="360"/>
+      </w:pPr>
+      <w:rPr>
+        <w:rFonts w:ascii="Courier New" w:eastAsia="Courier New" w:hAnsi="Courier New" w:cs="Courier New"/>
+      </w:rPr>
+    </w:lvl>
+    <w:lvl w:ilvl="2">
+      <w:start w:val="1"/>
+      <w:numFmt w:val="bullet"/>
+      <w:lvlText w:val="▪"/>
+      <w:lvlJc w:val="left"/>
+      <w:pPr>
+        <w:ind w:left="2160" w:hanging="360"/>
+      </w:pPr>
+      <w:rPr>
+        <w:rFonts w:ascii="Noto Sans Symbols" w:eastAsia="Noto Sans Symbols" w:hAnsi="Noto Sans Symbols" w:cs="Noto Sans Symbols"/>
+      </w:rPr>
+    </w:lvl>
+    <w:lvl w:ilvl="3">
+      <w:start w:val="1"/>
+      <w:numFmt w:val="bullet"/>
+      <w:lvlText w:val="●"/>
+      <w:lvlJc w:val="left"/>
+      <w:pPr>
+        <w:ind w:left="2880" w:hanging="360"/>
+      </w:pPr>
+      <w:rPr>
+        <w:rFonts w:ascii="Noto Sans Symbols" w:eastAsia="Noto Sans Symbols" w:hAnsi="Noto Sans Symbols" w:cs="Noto Sans Symbols"/>
+      </w:rPr>
+    </w:lvl>
+    <w:lvl w:ilvl="4">
+      <w:start w:val="1"/>
+      <w:numFmt w:val="bullet"/>
+      <w:lvlText w:val="o"/>
+      <w:lvlJc w:val="left"/>
+      <w:pPr>
+        <w:ind w:left="3600" w:hanging="360"/>
+      </w:pPr>
+      <w:rPr>
+        <w:rFonts w:ascii="Courier New" w:eastAsia="Courier New" w:hAnsi="Courier New" w:cs="Courier New"/>
+      </w:rPr>
+    </w:lvl>
+    <w:lvl w:ilvl="5">
+      <w:start w:val="1"/>
+      <w:numFmt w:val="bullet"/>
+      <w:lvlText w:val="▪"/>
+      <w:lvlJc w:val="left"/>
+      <w:pPr>
+        <w:ind w:left="4320" w:hanging="360"/>
+      </w:pPr>
+      <w:rPr>
+        <w:rFonts w:ascii="Noto Sans Symbols" w:eastAsia="Noto Sans Symbols" w:hAnsi="Noto Sans Symbols" w:cs="Noto Sans Symbols"/>
+      </w:rPr>
+    </w:lvl>
+    <w:lvl w:ilvl="6">
+      <w:start w:val="1"/>
+      <w:numFmt w:val="bullet"/>
+      <w:lvlText w:val="●"/>
+      <w:lvlJc w:val="left"/>
+      <w:pPr>
+        <w:ind w:left="5040" w:hanging="360"/>
+      </w:pPr>
+      <w:rPr>
+        <w:rFonts w:ascii="Noto Sans Symbols" w:eastAsia="Noto Sans Symbols" w:hAnsi="Noto Sans Symbols" w:cs="Noto Sans Symbols"/>
+      </w:rPr>
+    </w:lvl>
+    <w:lvl w:ilvl="7">
+      <w:start w:val="1"/>
+      <w:numFmt w:val="bullet"/>
+      <w:lvlText w:val="o"/>
+      <w:lvlJc w:val="left"/>
+      <w:pPr>
+        <w:ind w:left="5760" w:hanging="360"/>
+      </w:pPr>
+      <w:rPr>
+        <w:rFonts w:ascii="Courier New" w:eastAsia="Courier New" w:hAnsi="Courier New" w:cs="Courier New"/>
+      </w:rPr>
+    </w:lvl>
+    <w:lvl w:ilvl="8">
+      <w:start w:val="1"/>
+      <w:numFmt w:val="bullet"/>
+      <w:lvlText w:val="▪"/>
+      <w:lvlJc w:val="left"/>
+      <w:pPr>
+        <w:ind w:left="6480" w:hanging="360"/>
+      </w:pPr>
+      <w:rPr>
+        <w:rFonts w:ascii="Noto Sans Symbols" w:eastAsia="Noto Sans Symbols" w:hAnsi="Noto Sans Symbols" w:cs="Noto Sans Symbols"/>
+      </w:rPr>
+    </w:lvl>
+  </w:abstractNum>
+  <w:abstractNum w:abstractNumId="1" w15:restartNumberingAfterBreak="0">
     <w:nsid w:val="198E08B4"/>
     <w:multiLevelType w:val="hybridMultilevel"/>
     <w:tmpl w:val="39085180"/>
@@ -3025,7 +3288,7 @@
       </w:rPr>
     </w:lvl>
   </w:abstractNum>
-  <w:abstractNum w:abstractNumId="1" w15:restartNumberingAfterBreak="0">
+  <w:abstractNum w:abstractNumId="2" w15:restartNumberingAfterBreak="0">
     <w:nsid w:val="218E74C4"/>
     <w:multiLevelType w:val="hybridMultilevel"/>
     <w:tmpl w:val="BC827FB8"/>
@@ -3138,7 +3401,7 @@
       </w:rPr>
     </w:lvl>
   </w:abstractNum>
-  <w:abstractNum w:abstractNumId="2" w15:restartNumberingAfterBreak="0">
+  <w:abstractNum w:abstractNumId="3" w15:restartNumberingAfterBreak="0">
     <w:nsid w:val="46920C68"/>
     <w:multiLevelType w:val="multilevel"/>
     <w:tmpl w:val="6A444CFA"/>
@@ -3251,7 +3514,7 @@
       </w:rPr>
     </w:lvl>
   </w:abstractNum>
-  <w:abstractNum w:abstractNumId="3" w15:restartNumberingAfterBreak="0">
+  <w:abstractNum w:abstractNumId="4" w15:restartNumberingAfterBreak="0">
     <w:nsid w:val="4C6461DD"/>
     <w:multiLevelType w:val="multilevel"/>
     <w:tmpl w:val="30E29FC0"/>
@@ -3364,7 +3627,7 @@
       </w:rPr>
     </w:lvl>
   </w:abstractNum>
-  <w:abstractNum w:abstractNumId="4" w15:restartNumberingAfterBreak="0">
+  <w:abstractNum w:abstractNumId="5" w15:restartNumberingAfterBreak="0">
     <w:nsid w:val="51950108"/>
     <w:multiLevelType w:val="multilevel"/>
     <w:tmpl w:val="89D4FBF6"/>
@@ -3477,7 +3740,7 @@
       </w:rPr>
     </w:lvl>
   </w:abstractNum>
-  <w:abstractNum w:abstractNumId="5" w15:restartNumberingAfterBreak="0">
+  <w:abstractNum w:abstractNumId="6" w15:restartNumberingAfterBreak="0">
     <w:nsid w:val="696B01DA"/>
     <w:multiLevelType w:val="multilevel"/>
     <w:tmpl w:val="6E9E3D92"/>
@@ -3590,7 +3853,7 @@
       </w:rPr>
     </w:lvl>
   </w:abstractNum>
-  <w:abstractNum w:abstractNumId="6" w15:restartNumberingAfterBreak="0">
+  <w:abstractNum w:abstractNumId="7" w15:restartNumberingAfterBreak="0">
     <w:nsid w:val="6C0F419A"/>
     <w:multiLevelType w:val="multilevel"/>
     <w:tmpl w:val="DE9244C2"/>
@@ -3703,7 +3966,7 @@
       </w:rPr>
     </w:lvl>
   </w:abstractNum>
-  <w:abstractNum w:abstractNumId="7" w15:restartNumberingAfterBreak="0">
+  <w:abstractNum w:abstractNumId="8" w15:restartNumberingAfterBreak="0">
     <w:nsid w:val="73C802FB"/>
     <w:multiLevelType w:val="hybridMultilevel"/>
     <w:tmpl w:val="B3E25364"/>
@@ -3816,7 +4079,7 @@
       </w:rPr>
     </w:lvl>
   </w:abstractNum>
-  <w:abstractNum w:abstractNumId="8" w15:restartNumberingAfterBreak="0">
+  <w:abstractNum w:abstractNumId="9" w15:restartNumberingAfterBreak="0">
     <w:nsid w:val="73EA1B21"/>
     <w:multiLevelType w:val="hybridMultilevel"/>
     <w:tmpl w:val="FE1E669E"/>
@@ -3929,7 +4192,7 @@
       </w:rPr>
     </w:lvl>
   </w:abstractNum>
-  <w:abstractNum w:abstractNumId="9" w15:restartNumberingAfterBreak="0">
+  <w:abstractNum w:abstractNumId="10" w15:restartNumberingAfterBreak="0">
     <w:nsid w:val="7BF06ED4"/>
     <w:multiLevelType w:val="multilevel"/>
     <w:tmpl w:val="FB48AB3A"/>
@@ -4042,7 +4305,7 @@
       </w:rPr>
     </w:lvl>
   </w:abstractNum>
-  <w:abstractNum w:abstractNumId="10" w15:restartNumberingAfterBreak="0">
+  <w:abstractNum w:abstractNumId="11" w15:restartNumberingAfterBreak="0">
     <w:nsid w:val="7EE72EBB"/>
     <w:multiLevelType w:val="multilevel"/>
     <w:tmpl w:val="DC845906"/>
@@ -4156,37 +4419,40 @@
     </w:lvl>
   </w:abstractNum>
   <w:num w:numId="1" w16cid:durableId="1618830931">
+    <w:abstractNumId w:val="6"/>
+  </w:num>
+  <w:num w:numId="2" w16cid:durableId="1615790290">
+    <w:abstractNumId w:val="4"/>
+  </w:num>
+  <w:num w:numId="3" w16cid:durableId="1797291698">
+    <w:abstractNumId w:val="10"/>
+  </w:num>
+  <w:num w:numId="4" w16cid:durableId="324674514">
+    <w:abstractNumId w:val="7"/>
+  </w:num>
+  <w:num w:numId="5" w16cid:durableId="1906911474">
+    <w:abstractNumId w:val="3"/>
+  </w:num>
+  <w:num w:numId="6" w16cid:durableId="460735181">
+    <w:abstractNumId w:val="11"/>
+  </w:num>
+  <w:num w:numId="7" w16cid:durableId="1250119026">
     <w:abstractNumId w:val="5"/>
   </w:num>
-  <w:num w:numId="2" w16cid:durableId="1615790290">
-    <w:abstractNumId w:val="3"/>
+  <w:num w:numId="8" w16cid:durableId="9259455">
+    <w:abstractNumId w:val="8"/>
   </w:num>
-  <w:num w:numId="3" w16cid:durableId="1797291698">
+  <w:num w:numId="9" w16cid:durableId="1380587497">
     <w:abstractNumId w:val="9"/>
   </w:num>
-  <w:num w:numId="4" w16cid:durableId="324674514">
-    <w:abstractNumId w:val="6"/>
+  <w:num w:numId="10" w16cid:durableId="938101241">
+    <w:abstractNumId w:val="1"/>
   </w:num>
-  <w:num w:numId="5" w16cid:durableId="1906911474">
+  <w:num w:numId="11" w16cid:durableId="160195687">
     <w:abstractNumId w:val="2"/>
   </w:num>
-  <w:num w:numId="6" w16cid:durableId="460735181">
-    <w:abstractNumId w:val="10"/>
-  </w:num>
-  <w:num w:numId="7" w16cid:durableId="1250119026">
-    <w:abstractNumId w:val="4"/>
-  </w:num>
-  <w:num w:numId="8" w16cid:durableId="9259455">
-    <w:abstractNumId w:val="7"/>
-  </w:num>
-  <w:num w:numId="9" w16cid:durableId="1380587497">
-    <w:abstractNumId w:val="8"/>
-  </w:num>
-  <w:num w:numId="10" w16cid:durableId="938101241">
+  <w:num w:numId="12" w16cid:durableId="1816680922">
     <w:abstractNumId w:val="0"/>
-  </w:num>
-  <w:num w:numId="11" w16cid:durableId="160195687">
-    <w:abstractNumId w:val="1"/>
   </w:num>
 </w:numbering>
 </file>

</xml_diff>